<commit_message>
Bump version to v1.3.0
Includes the balanced bidirectional layout and multi-select namespace
filter. Update image tag, Helm chart version/appVersion, docker-compose,
README, and the regenerated deployment guide (md + docx).

Co-Authored-By: Claude Opus 4.8 <noreply@anthropic.com>
</commit_message>
<xml_diff>
--- a/Pulsebox-Deployment-Guide.docx
+++ b/Pulsebox-Deployment-Guide.docx
@@ -36,15 +36,15 @@
         <w:pStyle w:val="Code"/>
       </w:pPr>
       <w:r>
-        <w:t xml:space="preserve">docker build -t ramtinboreili/pulsebox:v1.0.0 --build-arg VERSION=v1.0.0 .</w:t>
-      </w:r>
-    </w:p>
-    <w:p>
-      <w:pPr>
-        <w:pStyle w:val="Code"/>
-      </w:pPr>
-      <w:r>
-        <w:t xml:space="preserve">docker push ramtinboreili/pulsebox:v1.0.0</w:t>
+        <w:t xml:space="preserve">docker build -t ramtinboreili/pulsebox:v1.3.0 --build-arg VERSION=v1.3.0 .</w:t>
+      </w:r>
+    </w:p>
+    <w:p>
+      <w:pPr>
+        <w:pStyle w:val="Code"/>
+      </w:pPr>
+      <w:r>
+        <w:t xml:space="preserve">docker push ramtinboreili/pulsebox:v1.3.0</w:t>
       </w:r>
     </w:p>
     <w:p>
@@ -256,7 +256,7 @@
           <w:rFonts w:ascii="Consolas" w:hAnsi="Consolas"/>
           <w:color w:val="C7254E"/>
         </w:rPr>
-        <w:t xml:space="preserve">docker pull ramtinboreili/pulsebox:v1.0.0</w:t>
+        <w:t xml:space="preserve">docker pull ramtinboreili/pulsebox:v1.3.0</w:t>
       </w:r>
       <w:r>
         <w:t xml:space="preserve">.</w:t>
@@ -397,7 +397,7 @@
         <w:pStyle w:val="Code"/>
       </w:pPr>
       <w:r>
-        <w:t xml:space="preserve">docker build -t ramtinboreili/pulsebox:v1.0.0 --build-arg VERSION=v1.0.0 .</w:t>
+        <w:t xml:space="preserve">docker build -t ramtinboreili/pulsebox:v1.3.0 --build-arg VERSION=v1.3.0 .</w:t>
       </w:r>
     </w:p>
     <w:p>
@@ -413,7 +413,7 @@
         <w:pStyle w:val="Code"/>
       </w:pPr>
       <w:r>
-        <w:t xml:space="preserve">docker push ramtinboreili/pulsebox:v1.0.0</w:t>
+        <w:t xml:space="preserve">docker push ramtinboreili/pulsebox:v1.3.0</w:t>
       </w:r>
     </w:p>
     <w:p>
@@ -527,7 +527,7 @@
         <w:pStyle w:val="Code"/>
       </w:pPr>
       <w:r>
-        <w:t xml:space="preserve">  --set image.tag=v1.0.0 \</w:t>
+        <w:t xml:space="preserve">  --set image.tag=v1.3.0 \</w:t>
       </w:r>
     </w:p>
     <w:p>
@@ -589,7 +589,7 @@
         <w:pStyle w:val="Code"/>
       </w:pPr>
       <w:r>
-        <w:t xml:space="preserve">  tag: v1.0.0</w:t>
+        <w:t xml:space="preserve">  tag: v1.3.0</w:t>
       </w:r>
     </w:p>
     <w:p>
@@ -690,7 +690,7 @@
         <w:pStyle w:val="Code"/>
       </w:pPr>
       <w:r>
-        <w:t xml:space="preserve">helm package helm/pulsebox                               # produce pulsebox-1.0.0.tgz to share</w:t>
+        <w:t xml:space="preserve">helm package helm/pulsebox                               # produce pulsebox-1.3.0.tgz to share</w:t>
       </w:r>
     </w:p>
     <w:p>
@@ -1593,7 +1593,7 @@
         <w:pStyle w:val="Code"/>
       </w:pPr>
       <w:r>
-        <w:t xml:space="preserve">git tag v1.0.0 &amp;&amp; git push --tags</w:t>
+        <w:t xml:space="preserve">git tag v1.3.0 &amp;&amp; git push --tags</w:t>
       </w:r>
     </w:p>
     <w:p>
@@ -1759,7 +1759,7 @@
           <w:rFonts w:ascii="Consolas" w:hAnsi="Consolas"/>
           <w:color w:val="C7254E"/>
         </w:rPr>
-        <w:t xml:space="preserve">docker pull ramtinboreili/pulsebox:v1.0.0</w:t>
+        <w:t xml:space="preserve">docker pull ramtinboreili/pulsebox:v1.3.0</w:t>
       </w:r>
       <w:r>
         <w:t xml:space="preserve">.</w:t>

</xml_diff>